<commit_message>
Add epidural depot model approximation and spinal exclusion discussion
- Added new section: Considerations for neuraxial techniques (epidural and spinal)
- Epidural: emphasized depot model CAN adequately approximate epidural pharmacokinetics
- Spinal: excluded due to unique CSF dynamics, small doses, single-shot nature
- Updated Table 1 with epidural administration row in all files (docx + pptx)
- Added spinal exclusion footnote to PPTX Table 1 slides
- Updated limitations section to reference neuraxial considerations
- All changes applied to both English and Japanese versions

Co-Authored-By: Tatsuki Onishi <bougtoir@gmail.com>
</commit_message>
<xml_diff>
--- a/bja-initial-compartment-pk/BJA_Manuscript_English.docx
+++ b/bja-initial-compartment-pk/BJA_Manuscript_English.docx
@@ -328,7 +328,7 @@
           <w:i w:val="0"/>
           <w:sz w:val="24"/>
         </w:rPr>
-        <w:t>However, in regional anaesthesia, the drug is not administered intravenously. It is deposited into tissue—perineural space, fascial planes, or epidural space—where systemic absorption depends on local blood flow, tissue binding, and the physicochemical properties of both the drug and the tissue.7,8 Recent work by De Cassai and colleagues, published in this journal, has advanced our understanding of local anaesthetic pharmacokinetics in fascial plane blocks, highlighting the roles of epinephrine, tissue vascularity, and fascial microanatomy in determining systemic absorption profiles.9 Similarly, Schwenk and colleagues have drawn attention to the emergence of lidocaine as a persistent cause of LAST-related mortality.10</w:t>
+        <w:t>However, in regional anaesthesia, the drug is not administered intravenously. It is deposited into tissue—perineural space, fascial planes, or epidural space—where systemic absorption depends on local blood flow, tissue binding, and the physicochemical properties of both the drug and the tissue.7,8 Notably, neuraxial techniques introduce additional pharmacokinetic complexity: epidural administration involves simultaneous absorption via epidural fat, dural transfer into cerebrospinal fluid (CSF), and vascular uptake, whilst intrathecal (spinal) administration deposits drug directly into the CSF with unique distribution and absorption kinetics that differ from all peripheral routes. Recent work by De Cassai and colleagues, published in this journal, has advanced our understanding of local anaesthetic pharmacokinetics in fascial plane blocks, highlighting the roles of epinephrine, tissue vascularity, and fascial microanatomy in determining systemic absorption profiles.9 Similarly, Schwenk and colleagues have drawn attention to the emergence of lidocaine as a persistent cause of LAST-related mortality.10</w:t>
       </w:r>
     </w:p>
     <w:p>
@@ -1035,6 +1035,70 @@
           </w:p>
         </w:tc>
       </w:tr>
+      <w:tr>
+        <w:tc>
+          <w:tcPr>
+            <w:tcW w:type="dxa" w:w="2340"/>
+          </w:tcPr>
+          <w:p>
+            <w:r>
+              <w:rPr>
+                <w:rFonts w:ascii="Times New Roman" w:hAnsi="Times New Roman"/>
+                <w:sz w:val="20"/>
+              </w:rPr>
+              <w:t>Epidural administration</w:t>
+            </w:r>
+          </w:p>
+        </w:tc>
+        <w:tc>
+          <w:tcPr>
+            <w:tcW w:type="dxa" w:w="2340"/>
+          </w:tcPr>
+          <w:p>
+            <w:r>
+              <w:rPr>
+                <w:rFonts w:ascii="Times New Roman" w:hAnsi="Times New Roman"/>
+                <w:sz w:val="20"/>
+              </w:rPr>
+              <w:t>Depot (multi-pathway)</w:t>
+              <w:br/>
+              <w:t>Fat + dural transfer + vascular</w:t>
+            </w:r>
+          </w:p>
+        </w:tc>
+        <w:tc>
+          <w:tcPr>
+            <w:tcW w:type="dxa" w:w="2340"/>
+          </w:tcPr>
+          <w:p>
+            <w:r>
+              <w:rPr>
+                <w:rFonts w:ascii="Times New Roman" w:hAnsi="Times New Roman"/>
+                <w:sz w:val="20"/>
+              </w:rPr>
+              <w:t>Intermediate,</w:t>
+              <w:br/>
+              <w:t>delayed</w:t>
+            </w:r>
+          </w:p>
+        </w:tc>
+        <w:tc>
+          <w:tcPr>
+            <w:tcW w:type="dxa" w:w="2340"/>
+          </w:tcPr>
+          <w:p>
+            <w:r>
+              <w:rPr>
+                <w:rFonts w:ascii="Times New Roman" w:hAnsi="Times New Roman"/>
+                <w:sz w:val="20"/>
+              </w:rPr>
+              <w:t>Adequately approximated</w:t>
+              <w:br/>
+              <w:t>by depot model</w:t>
+            </w:r>
+          </w:p>
+        </w:tc>
+      </w:tr>
     </w:tbl>
     <w:p>
       <w:r>
@@ -1066,6 +1130,51 @@
           <w:sz w:val="24"/>
         </w:rPr>
         <w:t>This approach acknowledges several important realities. First, the pharmacokinetic evidence supports higher doses for fascial plane blocks where absorption is slow and predictable.9,11 Second, it provides a rational basis for the empirical observation that LAST is rare despite frequent exceeding of traditional dose limits in regional practice.12 Third, it identifies the scenarios of genuine concern—failed blocks and intravascular injection—where adherence to conservative dose limits and vigilant monitoring are most important.</w:t>
+      </w:r>
+    </w:p>
+    <w:p>
+      <w:pPr>
+        <w:pStyle w:val="Heading1"/>
+      </w:pPr>
+      <w:r>
+        <w:rPr>
+          <w:rFonts w:ascii="Times New Roman" w:hAnsi="Times New Roman"/>
+          <w:color w:val="000000"/>
+        </w:rPr>
+        <w:t>Considerations for neuraxial techniques: epidural and spinal anaesthesia</w:t>
+      </w:r>
+    </w:p>
+    <w:p>
+      <w:r>
+        <w:rPr>
+          <w:rFonts w:ascii="Times New Roman" w:hAnsi="Times New Roman"/>
+          <w:b w:val="0"/>
+          <w:i w:val="0"/>
+          <w:sz w:val="24"/>
+        </w:rPr>
+        <w:t>The framework presented above focuses primarily on peripheral nerve blocks and fascial plane blocks, where the initial compartment can be reasonably approximated as either vessel-poor tissue (successful block) or vessel-rich tissue/plasma (failed block). However, two neuraxial routes—epidural and spinal (intrathecal) administration—deserve specific consideration, as their pharmacokinetics present distinct challenges for compartmental modelling.</w:t>
+      </w:r>
+    </w:p>
+    <w:p>
+      <w:r>
+        <w:rPr>
+          <w:rFonts w:ascii="Times New Roman" w:hAnsi="Times New Roman"/>
+          <w:b w:val="0"/>
+          <w:i w:val="0"/>
+          <w:sz w:val="24"/>
+        </w:rPr>
+        <w:t>Epidural administration of local anaesthetics involves drug deposition into the epidural space, where absorption occurs via three parallel pathways: (i) distribution into epidural fat, which acts as a local depot with slow release; (ii) transfer across the dura mater into the cerebrospinal fluid (CSF), where it accesses spinal nerve roots to produce neural blockade; and (iii) vascular absorption from the rich epidural venous plexus into the systemic circulation.15,16 Importantly, this multi-pathway absorption can be well approximated by a depot compartment model with first-order absorption kinetics (ka), analogous to the peripheral block model described above. Population pharmacokinetic studies of epidural local anaesthetics have successfully employed depot-augmented compartment models, validating this approach.20 The depot model thus provides an adequate and practical framework for epidural administration within the initial compartment paradigm proposed here. Epidural administration can be considered as a depot-start scenario with absorption characteristics intermediate between a successful fascial plane block (pure vessel-poor tissue) and a failed block (rapid vascular uptake), reflecting the mixed nature of the epidural space. Although more sophisticated multi-pathway models could further refine the simulation of the three parallel absorption routes, the depot approximation is sufficient for clinical dose guidance and integration into the proposed framework.</w:t>
+      </w:r>
+    </w:p>
+    <w:p>
+      <w:r>
+        <w:rPr>
+          <w:rFonts w:ascii="Times New Roman" w:hAnsi="Times New Roman"/>
+          <w:b w:val="0"/>
+          <w:i w:val="0"/>
+          <w:sz w:val="24"/>
+        </w:rPr>
+        <w:t>Spinal (intrathecal) anaesthesia was not included in the primary analysis of this review. Intrathecal administration deposits drug directly into the CSF, a unique pharmacokinetic compartment that does not correspond to any of the four compartments in the current framework (plasma, BRT, BPT, or depot). Drug distribution within the CSF is governed by factors such as baricity, patient positioning, CSF volume, and spinal curvature, none of which are captured by conventional compartmental models.16 Furthermore, spinal anaesthesia is almost exclusively performed as a single-shot technique with small drug doses (e.g. bupivacaine 10–15 mg), making systemic toxicity from intrathecal dosing alone exceedingly rare. For these reasons—the pharmacokinetic uniqueness of CSF distribution, the small doses employed, and the predominantly single-shot nature of the technique—we have deliberately excluded spinal anaesthesia from the initial compartment framework. Extending the model to include a CSF compartment would add considerable complexity without proportionate clinical benefit for the question of systemic toxicity and maximum dose.</w:t>
       </w:r>
     </w:p>
     <w:p>
@@ -1110,7 +1219,7 @@
           <w:i w:val="0"/>
           <w:sz w:val="24"/>
         </w:rPr>
-        <w:t>We acknowledge several limitations of the framework proposed here. The pharmacokinetic parameters for tissue absorption of local anaesthetics from specific injection sites are incompletely characterised. Block success is a spectrum rather than a binary state, and the proportion of drug deposited in vessel-poor versus vessel-rich tissue cannot be precisely determined clinically. Individual variation in tissue vascularity, protein binding, and hepatic clearance introduces additional uncertainty. Nevertheless, we believe that acknowledging the fundamental dependence of pharmacokinetics on the initial compartment, even imperfectly, represents a significant advance over the current approach of ignoring it entirely.</w:t>
+        <w:t>We acknowledge several limitations of the framework proposed here. The pharmacokinetic parameters for tissue absorption of local anaesthetics from specific injection sites are incompletely characterised. Block success is a spectrum rather than a binary state, and the proportion of drug deposited in vessel-poor versus vessel-rich tissue cannot be precisely determined clinically. Individual variation in tissue vascularity, protein binding, and hepatic clearance introduces additional uncertainty. As discussed above, epidural administration can be adequately approximated by a depot compartment model despite its multi-pathway absorption, whilst spinal anaesthesia was excluded from this framework due to its unique CSF pharmacokinetics and the small doses employed. Nevertheless, we believe that acknowledging the fundamental dependence of pharmacokinetics on the initial compartment, even imperfectly, represents a significant advance over the current approach of ignoring it entirely.</w:t>
       </w:r>
     </w:p>
     <w:p>

</xml_diff>

<commit_message>
Fix non-neutral language: remove inadvertently, misplacement, genuine concern
Co-Authored-By: Tatsuki Onishi <bougtoir@gmail.com>
</commit_message>
<xml_diff>
--- a/bja-initial-compartment-pk/BJA_Manuscript_English.docx
+++ b/bja-initial-compartment-pk/BJA_Manuscript_English.docx
@@ -386,7 +386,7 @@
           <w:rFonts w:ascii="Times New Roman" w:hAnsi="Times New Roman"/>
           <w:sz w:val="24"/>
         </w:rPr>
-        <w:t>Scenario B (failed block or intravascular injection): The drug is inadvertently deposited into a vascular structure or highly perfused tissue (vessel-rich group). Systemic absorption is rapid, equivalent or near-equivalent to intravenous administration. Cmax is high and occurs early (low Tmax), potentially exceeding the threshold for central nervous system or cardiovascular toxicity.</w:t>
+        <w:t>Scenario B (failed block or intravascular injection): The drug is deposited into a vascular structure or highly perfused tissue (vessel-rich group). Systemic absorption is rapid, equivalent or near-equivalent to intravenous administration. Cmax is high and occurs early (low Tmax), potentially exceeding the threshold for central nervous system or cardiovascular toxicity.</w:t>
       </w:r>
     </w:p>
     <w:p>
@@ -920,7 +920,7 @@
               </w:rPr>
               <w:t>Failed block</w:t>
               <w:br/>
-              <w:t>(tissue misplacement)</w:t>
+              <w:t>(vessel-rich deposition)</w:t>
             </w:r>
           </w:p>
         </w:tc>
@@ -1129,7 +1129,7 @@
           <w:i w:val="0"/>
           <w:sz w:val="24"/>
         </w:rPr>
-        <w:t>This approach acknowledges several important realities. First, the pharmacokinetic evidence supports higher doses for fascial plane blocks where absorption is slow and predictable.9,11 Second, it provides a rational basis for the empirical observation that LAST is rare despite frequent exceeding of traditional dose limits in regional practice.12 Third, it identifies the scenarios of genuine concern—failed blocks and intravascular injection—where adherence to conservative dose limits and vigilant monitoring are most important.</w:t>
+        <w:t>This approach acknowledges several important realities. First, the pharmacokinetic evidence supports higher doses for fascial plane blocks where absorption is slow and predictable.9,11 Second, it provides a rational basis for the empirical observation that LAST is rare despite frequent exceeding of traditional dose limits in regional practice.12 Third, it identifies the scenarios with rapid systemic absorption—failed blocks and intravascular injection—where adherence to conservative dose limits and vigilant monitoring are most important.</w:t>
       </w:r>
     </w:p>
     <w:p>

</xml_diff>